<commit_message>
align formating for table
</commit_message>
<xml_diff>
--- a/SOA-C03/01.1-SOA-C03_Exam_Cheat-Sheet.docx
+++ b/SOA-C03/01.1-SOA-C03_Exam_Cheat-Sheet.docx
@@ -6470,7 +6470,23 @@
           <w:bCs/>
           <w:lang w:val="en-AU"/>
         </w:rPr>
-        <w:t>IAM policy versus bucket policy</w:t>
+        <w:t>IAM policy v</w:t>
+      </w:r>
+      <w:r>
+        <w:rPr>
+          <w:b/>
+          <w:bCs/>
+          <w:lang w:val="en-AU"/>
+        </w:rPr>
+        <w:t>/</w:t>
+      </w:r>
+      <w:r>
+        <w:rPr>
+          <w:b/>
+          <w:bCs/>
+          <w:lang w:val="en-AU"/>
+        </w:rPr>
+        <w:t>s bucket policy</w:t>
       </w:r>
     </w:p>
     <w:p>
@@ -8902,7 +8918,21 @@
         <w:rPr>
           <w:lang w:val="en-AU"/>
         </w:rPr>
-        <w:t xml:space="preserve">D — DNS: Does the name resolve to the correct IP? </w:t>
+        <w:t xml:space="preserve">D — </w:t>
+      </w:r>
+      <w:r>
+        <w:rPr>
+          <w:b/>
+          <w:bCs/>
+          <w:lang w:val="en-AU"/>
+        </w:rPr>
+        <w:t>DNS</w:t>
+      </w:r>
+      <w:r>
+        <w:rPr>
+          <w:lang w:val="en-AU"/>
+        </w:rPr>
+        <w:t xml:space="preserve">: Does the name resolve to the correct IP? </w:t>
       </w:r>
     </w:p>
     <w:p>
@@ -8920,7 +8950,21 @@
         <w:rPr>
           <w:lang w:val="en-AU"/>
         </w:rPr>
-        <w:t xml:space="preserve">R — Route: Is there a matching route in both directions? </w:t>
+        <w:t xml:space="preserve">R — </w:t>
+      </w:r>
+      <w:r>
+        <w:rPr>
+          <w:b/>
+          <w:bCs/>
+          <w:lang w:val="en-AU"/>
+        </w:rPr>
+        <w:t>Route</w:t>
+      </w:r>
+      <w:r>
+        <w:rPr>
+          <w:lang w:val="en-AU"/>
+        </w:rPr>
+        <w:t xml:space="preserve">: Is there a matching route in both directions? </w:t>
       </w:r>
     </w:p>
     <w:p>
@@ -8938,7 +8982,21 @@
         <w:rPr>
           <w:lang w:val="en-AU"/>
         </w:rPr>
-        <w:t xml:space="preserve">S — Security group: Are the required ports allowed? </w:t>
+        <w:t xml:space="preserve">S — </w:t>
+      </w:r>
+      <w:r>
+        <w:rPr>
+          <w:b/>
+          <w:bCs/>
+          <w:lang w:val="en-AU"/>
+        </w:rPr>
+        <w:t>Security group</w:t>
+      </w:r>
+      <w:r>
+        <w:rPr>
+          <w:lang w:val="en-AU"/>
+        </w:rPr>
+        <w:t xml:space="preserve">: Are the required ports allowed? </w:t>
       </w:r>
     </w:p>
     <w:p>
@@ -8956,7 +9014,21 @@
         <w:rPr>
           <w:lang w:val="en-AU"/>
         </w:rPr>
-        <w:t xml:space="preserve">N — NACL: Are inbound, outbound and ephemeral ports allowed? </w:t>
+        <w:t xml:space="preserve">N — </w:t>
+      </w:r>
+      <w:r>
+        <w:rPr>
+          <w:b/>
+          <w:bCs/>
+          <w:lang w:val="en-AU"/>
+        </w:rPr>
+        <w:t>NACL</w:t>
+      </w:r>
+      <w:r>
+        <w:rPr>
+          <w:lang w:val="en-AU"/>
+        </w:rPr>
+        <w:t xml:space="preserve">: Are inbound, outbound and ephemeral ports allowed? </w:t>
       </w:r>
     </w:p>
     <w:p>
@@ -8976,7 +9048,21 @@
         <w:rPr>
           <w:lang w:val="en-AU"/>
         </w:rPr>
-        <w:t>D — Destination: Is the service listening and healthy?</w:t>
+        <w:t xml:space="preserve">D — </w:t>
+      </w:r>
+      <w:r>
+        <w:rPr>
+          <w:b/>
+          <w:bCs/>
+          <w:lang w:val="en-AU"/>
+        </w:rPr>
+        <w:t>Destination</w:t>
+      </w:r>
+      <w:r>
+        <w:rPr>
+          <w:lang w:val="en-AU"/>
+        </w:rPr>
+        <w:t>: Is the service listening and healthy?</w:t>
       </w:r>
       <w:r>
         <w:rPr>
@@ -11329,29 +11415,21 @@
       <w:pPr>
         <w:spacing w:after="20"/>
         <w:rPr>
+          <w:lang w:val="en-AU"/>
+        </w:rPr>
+      </w:pPr>
+      <w:r>
+        <w:rPr>
           <w:b/>
           <w:bCs/>
           <w:lang w:val="en-AU"/>
         </w:rPr>
-      </w:pPr>
+        <w:t>vpc-flow-logs.amazonaws.com</w:t>
+      </w:r>
       <w:r>
         <w:rPr>
           <w:b/>
           <w:bCs/>
-          <w:lang w:val="en-AU"/>
-        </w:rPr>
-        <w:t>vpc-flow-logs.amazonaws.com</w:t>
-      </w:r>
-    </w:p>
-    <w:p>
-      <w:pPr>
-        <w:spacing w:after="20"/>
-        <w:rPr>
-          <w:lang w:val="en-AU"/>
-        </w:rPr>
-      </w:pPr>
-      <w:r>
-        <w:rPr>
           <w:lang w:val="en-AU"/>
         </w:rPr>
         <w:br/>
@@ -12928,15 +13006,7 @@
         <w:t>: DNS queries enter the VPC from on premises or another network.</w:t>
       </w:r>
       <w:r>
-        <w:t xml:space="preserve"> </w:t>
-      </w:r>
-      <w:proofErr w:type="gramStart"/>
-      <w:r>
-        <w:t>[</w:t>
-      </w:r>
-      <w:proofErr w:type="gramEnd"/>
-      <w:r>
-        <w:t xml:space="preserve">On-Prem </w:t>
+        <w:t xml:space="preserve"> [On-Prem </w:t>
       </w:r>
       <w:r>
         <w:sym w:font="Wingdings" w:char="F0E0"/>
@@ -12964,10 +13034,7 @@
         <w:t xml:space="preserve"> </w:t>
       </w:r>
       <w:r>
-        <w:t>[VPC</w:t>
-      </w:r>
-      <w:r>
-        <w:t xml:space="preserve"> </w:t>
+        <w:t xml:space="preserve">[VPC </w:t>
       </w:r>
       <w:r>
         <w:sym w:font="Wingdings" w:char="F0E0"/>
@@ -13796,11 +13863,6 @@
       <w:pPr>
         <w:pStyle w:val="Heading2"/>
       </w:pPr>
-    </w:p>
-    <w:p>
-      <w:pPr>
-        <w:pStyle w:val="Heading2"/>
-      </w:pPr>
       <w:r>
         <w:t>Route 53 routing policies</w:t>
       </w:r>
@@ -14487,7 +14549,6 @@
         <w:pStyle w:val="Heading2"/>
       </w:pPr>
       <w:r>
-        <w:lastRenderedPageBreak/>
         <w:t>Alias, CNAME, health and troubleshooting</w:t>
       </w:r>
     </w:p>
@@ -14515,6 +14576,7 @@
         <w:keepLines/>
       </w:pPr>
       <w:r>
+        <w:lastRenderedPageBreak/>
         <w:t>Evaluate Target Health uses health of the alias target; for complex alias trees, propagate health through every layer.</w:t>
       </w:r>
     </w:p>
@@ -15234,14 +15296,7 @@
               <w:rPr>
                 <w:lang w:val="en-AU"/>
               </w:rPr>
-              <w:t xml:space="preserve">Can preserve source IP; Proxy Protocol v2 </w:t>
-            </w:r>
-            <w:r>
-              <w:rPr>
-                <w:lang w:val="en-AU"/>
-              </w:rPr>
-              <w:lastRenderedPageBreak/>
-              <w:t>available</w:t>
+              <w:t>Can preserve source IP; Proxy Protocol v2 available</w:t>
             </w:r>
           </w:p>
         </w:tc>
@@ -15267,7 +15322,6 @@
               <w:rPr>
                 <w:lang w:val="en-AU"/>
               </w:rPr>
-              <w:lastRenderedPageBreak/>
               <w:t>WAF</w:t>
             </w:r>
           </w:p>
@@ -15404,6 +15458,7 @@
               <w:rPr>
                 <w:lang w:val="en-AU"/>
               </w:rPr>
+              <w:lastRenderedPageBreak/>
               <w:t>TLS</w:t>
             </w:r>
           </w:p>
@@ -15661,22 +15716,6 @@
           <w:bCs/>
           <w:lang w:val="en-AU"/>
         </w:rPr>
-        <w:br/>
-      </w:r>
-      <w:r>
-        <w:rPr>
-          <w:b/>
-          <w:bCs/>
-          <w:lang w:val="en-AU"/>
-        </w:rPr>
-        <w:br/>
-      </w:r>
-      <w:r>
-        <w:rPr>
-          <w:b/>
-          <w:bCs/>
-          <w:lang w:val="en-AU"/>
-        </w:rPr>
         <w:t>Instant decision rules</w:t>
       </w:r>
     </w:p>
@@ -15693,9 +15732,17 @@
       </w:pPr>
       <w:r>
         <w:rPr>
-          <w:lang w:val="en-AU"/>
-        </w:rPr>
-        <w:t xml:space="preserve">Host-based or path-based routing → ALB. </w:t>
+          <w:b/>
+          <w:bCs/>
+          <w:lang w:val="en-AU"/>
+        </w:rPr>
+        <w:t>Host-based or path-based routing</w:t>
+      </w:r>
+      <w:r>
+        <w:rPr>
+          <w:lang w:val="en-AU"/>
+        </w:rPr>
+        <w:t xml:space="preserve"> → ALB. </w:t>
       </w:r>
     </w:p>
     <w:p>
@@ -15711,9 +15758,17 @@
       </w:pPr>
       <w:r>
         <w:rPr>
-          <w:lang w:val="en-AU"/>
-        </w:rPr>
-        <w:t xml:space="preserve">Web application firewall → ALB + AWS WAF. </w:t>
+          <w:b/>
+          <w:bCs/>
+          <w:lang w:val="en-AU"/>
+        </w:rPr>
+        <w:t>Web application firewall</w:t>
+      </w:r>
+      <w:r>
+        <w:rPr>
+          <w:lang w:val="en-AU"/>
+        </w:rPr>
+        <w:t xml:space="preserve"> → ALB + AWS WAF. </w:t>
       </w:r>
     </w:p>
     <w:p>
@@ -15729,9 +15784,17 @@
       </w:pPr>
       <w:r>
         <w:rPr>
-          <w:lang w:val="en-AU"/>
-        </w:rPr>
-        <w:t xml:space="preserve">Cognito/OIDC login at the load balancer → ALB. </w:t>
+          <w:b/>
+          <w:bCs/>
+          <w:lang w:val="en-AU"/>
+        </w:rPr>
+        <w:t>Cognito/OIDC login at the load balancer</w:t>
+      </w:r>
+      <w:r>
+        <w:rPr>
+          <w:lang w:val="en-AU"/>
+        </w:rPr>
+        <w:t xml:space="preserve"> → ALB. </w:t>
       </w:r>
     </w:p>
     <w:p>
@@ -15747,9 +15810,17 @@
       </w:pPr>
       <w:r>
         <w:rPr>
-          <w:lang w:val="en-AU"/>
-        </w:rPr>
-        <w:t xml:space="preserve">Lambda as target → ALB. </w:t>
+          <w:b/>
+          <w:bCs/>
+          <w:lang w:val="en-AU"/>
+        </w:rPr>
+        <w:t>Lambda as target</w:t>
+      </w:r>
+      <w:r>
+        <w:rPr>
+          <w:lang w:val="en-AU"/>
+        </w:rPr>
+        <w:t xml:space="preserve"> → ALB. </w:t>
       </w:r>
     </w:p>
     <w:p>
@@ -15765,9 +15836,17 @@
       </w:pPr>
       <w:r>
         <w:rPr>
-          <w:lang w:val="en-AU"/>
-        </w:rPr>
-        <w:t xml:space="preserve">UDP → NLB. </w:t>
+          <w:b/>
+          <w:bCs/>
+          <w:lang w:val="en-AU"/>
+        </w:rPr>
+        <w:t>UDP</w:t>
+      </w:r>
+      <w:r>
+        <w:rPr>
+          <w:lang w:val="en-AU"/>
+        </w:rPr>
+        <w:t xml:space="preserve"> → NLB. </w:t>
       </w:r>
     </w:p>
     <w:p>
@@ -15783,9 +15862,17 @@
       </w:pPr>
       <w:r>
         <w:rPr>
-          <w:lang w:val="en-AU"/>
-        </w:rPr>
-        <w:t xml:space="preserve">Non-HTTP TCP application → NLB. </w:t>
+          <w:b/>
+          <w:bCs/>
+          <w:lang w:val="en-AU"/>
+        </w:rPr>
+        <w:t>Non-HTTP TCP application</w:t>
+      </w:r>
+      <w:r>
+        <w:rPr>
+          <w:lang w:val="en-AU"/>
+        </w:rPr>
+        <w:t xml:space="preserve"> → NLB. </w:t>
       </w:r>
     </w:p>
     <w:p>
@@ -15801,9 +15888,17 @@
       </w:pPr>
       <w:r>
         <w:rPr>
-          <w:lang w:val="en-AU"/>
-        </w:rPr>
-        <w:t xml:space="preserve">Fixed IP or allow-listing an EIP → NLB. </w:t>
+          <w:b/>
+          <w:bCs/>
+          <w:lang w:val="en-AU"/>
+        </w:rPr>
+        <w:t>Fixed IP or allow-listing an EIP</w:t>
+      </w:r>
+      <w:r>
+        <w:rPr>
+          <w:lang w:val="en-AU"/>
+        </w:rPr>
+        <w:t xml:space="preserve"> → NLB. </w:t>
       </w:r>
     </w:p>
     <w:p>
@@ -15819,9 +15914,17 @@
       </w:pPr>
       <w:r>
         <w:rPr>
-          <w:lang w:val="en-AU"/>
-        </w:rPr>
-        <w:t xml:space="preserve">TLS must reach the server without termination → NLB TCP listener on port 443. </w:t>
+          <w:b/>
+          <w:bCs/>
+          <w:lang w:val="en-AU"/>
+        </w:rPr>
+        <w:t>TLS must reach the server without termination</w:t>
+      </w:r>
+      <w:r>
+        <w:rPr>
+          <w:lang w:val="en-AU"/>
+        </w:rPr>
+        <w:t xml:space="preserve"> → NLB TCP listener on port 443. </w:t>
       </w:r>
     </w:p>
     <w:p>
@@ -15837,9 +15940,17 @@
       </w:pPr>
       <w:r>
         <w:rPr>
-          <w:lang w:val="en-AU"/>
-        </w:rPr>
-        <w:t xml:space="preserve">Need static IP plus Layer-7 routing → NLB with ALB as its target. </w:t>
+          <w:b/>
+          <w:bCs/>
+          <w:lang w:val="en-AU"/>
+        </w:rPr>
+        <w:t>Need static IP plus Layer-7 routing</w:t>
+      </w:r>
+      <w:r>
+        <w:rPr>
+          <w:lang w:val="en-AU"/>
+        </w:rPr>
+        <w:t xml:space="preserve"> → NLB with ALB as its target. </w:t>
       </w:r>
     </w:p>
     <w:p>
@@ -15855,9 +15966,17 @@
       </w:pPr>
       <w:r>
         <w:rPr>
-          <w:lang w:val="en-AU"/>
-        </w:rPr>
-        <w:t xml:space="preserve">Transparent security appliances → GWLB, not ALB/NLB. </w:t>
+          <w:b/>
+          <w:bCs/>
+          <w:lang w:val="en-AU"/>
+        </w:rPr>
+        <w:t>Transparent security appliances</w:t>
+      </w:r>
+      <w:r>
+        <w:rPr>
+          <w:lang w:val="en-AU"/>
+        </w:rPr>
+        <w:t xml:space="preserve"> → GWLB, not ALB/NLB. </w:t>
       </w:r>
       <w:r>
         <w:rPr>
@@ -16121,14 +16240,7 @@
               <w:rPr>
                 <w:lang w:val="en-AU"/>
               </w:rPr>
-              <w:t xml:space="preserve">Application logs, CPU, memory, </w:t>
-            </w:r>
-            <w:r>
-              <w:rPr>
-                <w:lang w:val="en-AU"/>
-              </w:rPr>
-              <w:lastRenderedPageBreak/>
-              <w:t>dependencies</w:t>
+              <w:t>Application logs, CPU, memory, dependencies</w:t>
             </w:r>
           </w:p>
         </w:tc>
@@ -16155,7 +16267,6 @@
               <w:rPr>
                 <w:lang w:val="en-AU"/>
               </w:rPr>
-              <w:lastRenderedPageBreak/>
               <w:t>TargetResponseTime</w:t>
             </w:r>
             <w:proofErr w:type="spellEnd"/>
@@ -16318,7 +16429,14 @@
               <w:rPr>
                 <w:lang w:val="en-AU"/>
               </w:rPr>
-              <w:t>Unhealthy registered targets</w:t>
+              <w:t xml:space="preserve">Unhealthy registered </w:t>
+            </w:r>
+            <w:r>
+              <w:rPr>
+                <w:lang w:val="en-AU"/>
+              </w:rPr>
+              <w:lastRenderedPageBreak/>
+              <w:t>targets</w:t>
             </w:r>
           </w:p>
         </w:tc>
@@ -16339,6 +16457,7 @@
               <w:rPr>
                 <w:lang w:val="en-AU"/>
               </w:rPr>
+              <w:lastRenderedPageBreak/>
               <w:t>SG, NACL, port, path, response code</w:t>
             </w:r>
           </w:p>
@@ -16453,36 +16572,6 @@
           <w:lang w:val="en-AU"/>
         </w:rPr>
       </w:pPr>
-    </w:p>
-    <w:p>
-      <w:pPr>
-        <w:spacing w:after="20"/>
-        <w:rPr>
-          <w:b/>
-          <w:bCs/>
-          <w:lang w:val="en-AU"/>
-        </w:rPr>
-      </w:pPr>
-    </w:p>
-    <w:p>
-      <w:pPr>
-        <w:spacing w:after="20"/>
-        <w:rPr>
-          <w:b/>
-          <w:bCs/>
-          <w:lang w:val="en-AU"/>
-        </w:rPr>
-      </w:pPr>
-    </w:p>
-    <w:p>
-      <w:pPr>
-        <w:spacing w:after="20"/>
-        <w:rPr>
-          <w:b/>
-          <w:bCs/>
-          <w:lang w:val="en-AU"/>
-        </w:rPr>
-      </w:pPr>
       <w:r>
         <w:rPr>
           <w:b/>
@@ -16820,7 +16909,6 @@
         <w:rPr>
           <w:lang w:val="en-AU"/>
         </w:rPr>
-        <w:lastRenderedPageBreak/>
         <w:t xml:space="preserve">Is the target overloaded? </w:t>
       </w:r>
     </w:p>
@@ -16971,6 +17059,7 @@
         <w:rPr>
           <w:lang w:val="en-AU"/>
         </w:rPr>
+        <w:lastRenderedPageBreak/>
         <w:t xml:space="preserve">Cross-zone balancing is off by default; provide healthy capacity in every enabled AZ or enable cross-zone balancing. </w:t>
       </w:r>
     </w:p>
@@ -17026,6 +17115,8 @@
       <w:proofErr w:type="spellStart"/>
       <w:r>
         <w:rPr>
+          <w:i/>
+          <w:iCs/>
           <w:lang w:val="en-AU"/>
         </w:rPr>
         <w:t>TCP_ELB_Reset_Count</w:t>
@@ -17458,7 +17549,6 @@
               <w:rPr>
                 <w:sz w:val="16"/>
               </w:rPr>
-              <w:lastRenderedPageBreak/>
               <w:t>Layer/protocol</w:t>
             </w:r>
           </w:p>
@@ -18426,7 +18516,6 @@
         <w:pStyle w:val="Heading2"/>
       </w:pPr>
       <w:r>
-        <w:lastRenderedPageBreak/>
         <w:t>Health and NLB traps</w:t>
       </w:r>
     </w:p>
@@ -18498,6 +18587,7 @@
         <w:pStyle w:val="Heading2"/>
       </w:pPr>
       <w:r>
+        <w:lastRenderedPageBreak/>
         <w:t>Roles and permissions</w:t>
       </w:r>
     </w:p>
@@ -18956,7 +19046,6 @@
               <w:rPr>
                 <w:sz w:val="18"/>
               </w:rPr>
-              <w:lastRenderedPageBreak/>
               <w:t>Forecast recurring demand</w:t>
             </w:r>
           </w:p>
@@ -19180,11 +19269,6 @@
     </w:tbl>
     <w:p>
       <w:pPr>
-        <w:spacing w:after="20"/>
-      </w:pPr>
-    </w:p>
-    <w:p>
-      <w:pPr>
         <w:pStyle w:val="Heading2"/>
       </w:pPr>
       <w:r>
@@ -19229,6 +19313,7 @@
         <w:keepLines/>
       </w:pPr>
       <w:r>
+        <w:lastRenderedPageBreak/>
         <w:t>Default instance warmup prevents new instances from distorting aggregated scaling metrics before they are ready.</w:t>
       </w:r>
     </w:p>
@@ -19336,7 +19421,6 @@
         <w:keepLines/>
       </w:pPr>
       <w:r>
-        <w:lastRenderedPageBreak/>
         <w:t>Scaling the wrong tier: follow the saturated metric; low web CPU with high DB waits is a database problem.</w:t>
       </w:r>
     </w:p>
@@ -19560,6 +19644,7 @@
                 <w:bCs/>
                 <w:lang w:val="en-AU"/>
               </w:rPr>
+              <w:lastRenderedPageBreak/>
               <w:t>Requirement</w:t>
             </w:r>
           </w:p>
@@ -20008,13 +20093,31 @@
           <w:bCs/>
           <w:lang w:val="en-AU"/>
         </w:rPr>
-        <w:t>Multi-AZ = availability. Read replica = scalability.</w:t>
+        <w:t xml:space="preserve">Multi-AZ = availability. </w:t>
+      </w:r>
+      <w:r>
+        <w:rPr>
+          <w:b/>
+          <w:bCs/>
+          <w:lang w:val="en-AU"/>
+        </w:rPr>
+        <w:br/>
+      </w:r>
+      <w:r>
+        <w:rPr>
+          <w:b/>
+          <w:bCs/>
+          <w:lang w:val="en-AU"/>
+        </w:rPr>
+        <w:t>Read replica = scalability.</w:t>
       </w:r>
     </w:p>
     <w:p>
       <w:pPr>
         <w:spacing w:after="20"/>
         <w:rPr>
+          <w:b/>
+          <w:bCs/>
           <w:lang w:val="en-AU"/>
         </w:rPr>
       </w:pPr>
@@ -20026,6 +20129,8 @@
       </w:r>
       <w:r>
         <w:rPr>
+          <w:b/>
+          <w:bCs/>
           <w:lang w:val="en-AU"/>
         </w:rPr>
         <w:t xml:space="preserve">For a traditional </w:t>
@@ -20033,6 +20138,8 @@
       <w:proofErr w:type="gramStart"/>
       <w:r>
         <w:rPr>
+          <w:b/>
+          <w:bCs/>
           <w:lang w:val="en-AU"/>
         </w:rPr>
         <w:t>Multi-AZ DB</w:t>
@@ -20040,6 +20147,8 @@
       <w:proofErr w:type="gramEnd"/>
       <w:r>
         <w:rPr>
+          <w:b/>
+          <w:bCs/>
           <w:lang w:val="en-AU"/>
         </w:rPr>
         <w:t xml:space="preserve"> instance:</w:t>
@@ -20121,18 +20230,21 @@
       <w:pPr>
         <w:spacing w:after="20"/>
         <w:rPr>
-          <w:lang w:val="en-AU"/>
-        </w:rPr>
-      </w:pPr>
-      <w:r>
-        <w:rPr>
-          <w:lang w:val="en-AU"/>
-        </w:rPr>
-        <w:lastRenderedPageBreak/>
+          <w:b/>
+          <w:bCs/>
+          <w:lang w:val="en-AU"/>
+        </w:rPr>
+      </w:pPr>
+      <w:r>
+        <w:rPr>
+          <w:lang w:val="en-AU"/>
+        </w:rPr>
         <w:br/>
       </w:r>
       <w:r>
         <w:rPr>
+          <w:b/>
+          <w:bCs/>
           <w:lang w:val="en-AU"/>
         </w:rPr>
         <w:t>Traditional read replicas:</w:t>
@@ -20534,6 +20646,7 @@
               <w:rPr>
                 <w:lang w:val="en-AU"/>
               </w:rPr>
+              <w:lastRenderedPageBreak/>
               <w:t>Cross-Region backup</w:t>
             </w:r>
           </w:p>
@@ -20670,19 +20783,19 @@
           <w:lang w:val="en-AU"/>
         </w:rPr>
       </w:pPr>
-    </w:p>
-    <w:p>
-      <w:pPr>
-        <w:spacing w:after="20"/>
-        <w:rPr>
-          <w:lang w:val="en-AU"/>
-        </w:rPr>
-      </w:pPr>
-      <w:r>
-        <w:rPr>
-          <w:lang w:val="en-AU"/>
-        </w:rPr>
-        <w:t>Remember:</w:t>
+      <w:r>
+        <w:rPr>
+          <w:b/>
+          <w:bCs/>
+          <w:lang w:val="en-AU"/>
+        </w:rPr>
+        <w:t>Remember</w:t>
+      </w:r>
+      <w:r>
+        <w:rPr>
+          <w:lang w:val="en-AU"/>
+        </w:rPr>
+        <w:t>:</w:t>
       </w:r>
     </w:p>
     <w:p>
@@ -20988,7 +21101,6 @@
                 <w:bCs/>
                 <w:lang w:val="en-AU"/>
               </w:rPr>
-              <w:lastRenderedPageBreak/>
               <w:t>Question asks for…</w:t>
             </w:r>
           </w:p>
@@ -21418,6 +21530,7 @@
         <w:rPr>
           <w:lang w:val="en-AU"/>
         </w:rPr>
+        <w:lastRenderedPageBreak/>
         <w:t>DatabaseConnections</w:t>
       </w:r>
       <w:proofErr w:type="spellEnd"/>
@@ -21583,7 +21696,19 @@
         <w:rPr>
           <w:lang w:val="en-AU"/>
         </w:rPr>
-        <w:t xml:space="preserve">, where applicable </w:t>
+        <w:t>, where applicable</w:t>
+      </w:r>
+      <w:r>
+        <w:rPr>
+          <w:lang w:val="en-AU"/>
+        </w:rPr>
+        <w:br/>
+      </w:r>
+      <w:r>
+        <w:rPr>
+          <w:lang w:val="en-AU"/>
+        </w:rPr>
+        <w:t xml:space="preserve"> </w:t>
       </w:r>
     </w:p>
     <w:p>
@@ -21919,7 +22044,6 @@
         <w:rPr>
           <w:lang w:val="en-AU"/>
         </w:rPr>
-        <w:lastRenderedPageBreak/>
         <w:t xml:space="preserve">Authentication token is valid for 15 minutes. </w:t>
       </w:r>
     </w:p>
@@ -22127,6 +22251,7 @@
         <w:rPr>
           <w:lang w:val="en-AU"/>
         </w:rPr>
+        <w:lastRenderedPageBreak/>
         <w:t xml:space="preserve">Check DNS resolution. </w:t>
       </w:r>
     </w:p>
@@ -22886,7 +23011,6 @@
         <w:pStyle w:val="Heading2"/>
       </w:pPr>
       <w:r>
-        <w:lastRenderedPageBreak/>
         <w:t>Operational rules</w:t>
       </w:r>
     </w:p>
@@ -22941,7 +23065,13 @@
         <w:keepLines/>
       </w:pPr>
       <w:r>
-        <w:t>High query latency/DB load -&gt; Database Insights; many short-lived application connections -&gt; RDS Proxy.</w:t>
+        <w:t xml:space="preserve">High query latency/DB load -&gt; Database Insights; </w:t>
+      </w:r>
+      <w:r>
+        <w:br/>
+      </w:r>
+      <w:r>
+        <w:t>many short-lived application connections -&gt; RDS Proxy.</w:t>
       </w:r>
     </w:p>
     <w:p>
@@ -22959,6 +23089,7 @@
         <w:keepLines/>
       </w:pPr>
       <w:r>
+        <w:lastRenderedPageBreak/>
         <w:t>StorageFull or low FreeStorageSpace can stop backups and writes; enable storage autoscaling where appropriate and alarm early.</w:t>
       </w:r>
     </w:p>
@@ -22976,7 +23107,27 @@
         <w:keepLines/>
       </w:pPr>
       <w:r>
-        <w:t>RDS Enhanced Monitoring uses a role trusted by monitoring.rds.amazonaws.com and commonly includes AmazonRDSEnhancedMonitoringRole.</w:t>
+        <w:t xml:space="preserve">RDS Enhanced Monitoring uses a role trusted by </w:t>
+      </w:r>
+      <w:r>
+        <w:rPr>
+          <w:i/>
+          <w:iCs/>
+        </w:rPr>
+        <w:t>monitoring.rds.amazonaws.com</w:t>
+      </w:r>
+      <w:r>
+        <w:t xml:space="preserve"> and commonly includes </w:t>
+      </w:r>
+      <w:r>
+        <w:rPr>
+          <w:i/>
+          <w:iCs/>
+        </w:rPr>
+        <w:t>AmazonRDSEnhancedMonitoringRole</w:t>
+      </w:r>
+      <w:r>
+        <w:t>.</w:t>
       </w:r>
     </w:p>
     <w:p>
@@ -23056,7 +23207,6 @@
         <w:keepLines/>
       </w:pPr>
       <w:r>
-        <w:lastRenderedPageBreak/>
         <w:t>ElastiCache Redis/Valkey replication groups support replicas and Multi-AZ failover; Memcached does not provide cross-Region global replication.</w:t>
       </w:r>
     </w:p>
@@ -23861,7 +24011,6 @@
           <w:bCs/>
           <w:lang w:val="en-AU"/>
         </w:rPr>
-        <w:lastRenderedPageBreak/>
         <w:t>Managed-node prerequisites</w:t>
       </w:r>
     </w:p>
@@ -24039,6 +24188,7 @@
         <w:rPr>
           <w:lang w:val="en-AU"/>
         </w:rPr>
+        <w:lastRenderedPageBreak/>
         <w:t>ssmmessages</w:t>
       </w:r>
       <w:proofErr w:type="spellEnd"/>
@@ -24323,6 +24473,7 @@
         <w:rPr>
           <w:b/>
           <w:bCs/>
+          <w:color w:val="FF0000"/>
           <w:lang w:val="en-AU"/>
         </w:rPr>
       </w:pPr>
@@ -24330,6 +24481,7 @@
         <w:rPr>
           <w:b/>
           <w:bCs/>
+          <w:color w:val="FF0000"/>
           <w:lang w:val="en-AU"/>
         </w:rPr>
         <w:t>Session Manager</w:t>
@@ -24396,7 +24548,6 @@
         <w:rPr>
           <w:lang w:val="en-AU"/>
         </w:rPr>
-        <w:lastRenderedPageBreak/>
         <w:t xml:space="preserve">Do not manage SSH keys. </w:t>
       </w:r>
     </w:p>
@@ -24486,6 +24637,7 @@
         <w:rPr>
           <w:b/>
           <w:bCs/>
+          <w:color w:val="FF0000"/>
           <w:lang w:val="en-AU"/>
         </w:rPr>
       </w:pPr>
@@ -24493,6 +24645,7 @@
         <w:rPr>
           <w:b/>
           <w:bCs/>
+          <w:color w:val="FF0000"/>
           <w:lang w:val="en-AU"/>
         </w:rPr>
         <w:t>Run Command</w:t>
@@ -24592,6 +24745,7 @@
         <w:rPr>
           <w:lang w:val="en-AU"/>
         </w:rPr>
+        <w:lastRenderedPageBreak/>
         <w:t xml:space="preserve">Tags/resource groups for dynamic targeting. </w:t>
       </w:r>
     </w:p>
@@ -24613,6 +24767,7 @@
         <w:rPr>
           <w:b/>
           <w:bCs/>
+          <w:color w:val="FF0000"/>
           <w:lang w:val="en-AU"/>
         </w:rPr>
       </w:pPr>
@@ -24620,6 +24775,7 @@
         <w:rPr>
           <w:b/>
           <w:bCs/>
+          <w:color w:val="FF0000"/>
           <w:lang w:val="en-AU"/>
         </w:rPr>
         <w:t>Patch Manager</w:t>
@@ -25194,6 +25350,7 @@
         <w:rPr>
           <w:lang w:val="en-AU"/>
         </w:rPr>
+        <w:lastRenderedPageBreak/>
         <w:t xml:space="preserve">Does the instance have the correct instance profile? </w:t>
       </w:r>
     </w:p>
@@ -25351,6 +25508,8 @@
           <w:numId w:val="52"/>
         </w:numPr>
         <w:rPr>
+          <w:i/>
+          <w:iCs/>
           <w:lang w:val="en-AU"/>
         </w:rPr>
       </w:pPr>
@@ -25360,16 +25519,11 @@
         </w:rPr>
         <w:t xml:space="preserve">Run: </w:t>
       </w:r>
-    </w:p>
-    <w:p>
-      <w:pPr>
-        <w:rPr>
-          <w:lang w:val="en-AU"/>
-        </w:rPr>
-      </w:pPr>
       <w:proofErr w:type="spellStart"/>
       <w:r>
         <w:rPr>
+          <w:i/>
+          <w:iCs/>
           <w:lang w:val="en-AU"/>
         </w:rPr>
         <w:t>ssm</w:t>
@@ -25377,6 +25531,8 @@
       <w:proofErr w:type="spellEnd"/>
       <w:r>
         <w:rPr>
+          <w:i/>
+          <w:iCs/>
           <w:lang w:val="en-AU"/>
         </w:rPr>
         <w:t>-cli get-diagnostics --output table</w:t>
@@ -25445,15 +25601,7 @@
                 <w:color w:val="FFFFFF"/>
                 <w:sz w:val="18"/>
               </w:rPr>
-              <w:t>C</w:t>
-            </w:r>
-            <w:r>
-              <w:rPr>
-                <w:b/>
-                <w:color w:val="FFFFFF"/>
-                <w:sz w:val="18"/>
-              </w:rPr>
-              <w:t>apability</w:t>
+              <w:t>Capability</w:t>
             </w:r>
           </w:p>
         </w:tc>
@@ -25814,7 +25962,6 @@
               <w:rPr>
                 <w:sz w:val="16"/>
               </w:rPr>
-              <w:lastRenderedPageBreak/>
               <w:t>Patch Manager</w:t>
             </w:r>
           </w:p>
@@ -26140,6 +26287,7 @@
         <w:ind w:left="518" w:hanging="346"/>
       </w:pPr>
       <w:r>
+        <w:lastRenderedPageBreak/>
         <w:t>5.  Operator IAM policy allows the requested SSM action and limits documents/targets as required.</w:t>
       </w:r>
     </w:p>
@@ -26229,7 +26377,6 @@
         <w:keepLines/>
       </w:pPr>
       <w:r>
-        <w:lastRenderedPageBreak/>
         <w:t>Use Fleet Manager's managed agent-update capability before designing custom agent update scripts.</w:t>
       </w:r>
     </w:p>
@@ -26732,6 +26879,7 @@
               <w:rPr>
                 <w:lang w:val="en-AU"/>
               </w:rPr>
+              <w:lastRenderedPageBreak/>
               <w:t>SCP</w:t>
             </w:r>
           </w:p>
@@ -27483,7 +27631,6 @@
               <w:rPr>
                 <w:lang w:val="en-AU"/>
               </w:rPr>
-              <w:lastRenderedPageBreak/>
               <w:t>iam:PassRole</w:t>
             </w:r>
             <w:proofErr w:type="spellEnd"/>
@@ -27867,6 +28014,7 @@
           <w:bCs/>
           <w:lang w:val="en-AU"/>
         </w:rPr>
+        <w:lastRenderedPageBreak/>
         <w:t>Cross-account role formula</w:t>
       </w:r>
     </w:p>
@@ -28007,6 +28155,8 @@
       <w:proofErr w:type="gramStart"/>
       <w:r>
         <w:rPr>
+          <w:i/>
+          <w:iCs/>
           <w:lang w:val="en-AU"/>
         </w:rPr>
         <w:t>sts:ExternalId</w:t>
@@ -28317,7 +28467,6 @@
         <w:rPr>
           <w:lang w:val="en-AU"/>
         </w:rPr>
-        <w:lastRenderedPageBreak/>
         <w:t>aws:MultiFactorAuthPresent</w:t>
       </w:r>
       <w:proofErr w:type="spellEnd"/>
@@ -28618,6 +28767,7 @@
         <w:rPr>
           <w:lang w:val="en-AU"/>
         </w:rPr>
+        <w:lastRenderedPageBreak/>
         <w:t xml:space="preserve">Write using a customer-managed key → service permission plus appropriate </w:t>
       </w:r>
       <w:proofErr w:type="spellStart"/>
@@ -28975,7 +29125,6 @@
         <w:rPr>
           <w:lang w:val="en-AU"/>
         </w:rPr>
-        <w:lastRenderedPageBreak/>
         <w:t xml:space="preserve">Prefer roles and temporary credentials over long-lived access keys. </w:t>
       </w:r>
       <w:hyperlink r:id="rId49" w:tgtFrame="_new" w:history="1">
@@ -29311,6 +29460,7 @@
         <w:rPr>
           <w:lang w:val="en-AU"/>
         </w:rPr>
+        <w:lastRenderedPageBreak/>
         <w:t xml:space="preserve">Check whether environment credentials are overriding the expected EC2 role. </w:t>
       </w:r>
     </w:p>
@@ -30146,7 +30296,6 @@
         <w:pStyle w:val="Heading2"/>
       </w:pPr>
       <w:r>
-        <w:lastRenderedPageBreak/>
         <w:t>Roles and temporary credentials</w:t>
       </w:r>
     </w:p>
@@ -30312,6 +30461,7 @@
         <w:keepLines/>
       </w:pPr>
       <w:r>
+        <w:lastRenderedPageBreak/>
         <w:t>Use IAM Identity Center/federation for workforce and multi-account access; avoid creating long-term IAM-user keys for normal operations.</w:t>
       </w:r>
     </w:p>
@@ -30418,7 +30568,6 @@
         <w:keepLines/>
       </w:pPr>
       <w:r>
-        <w:lastRenderedPageBreak/>
         <w:t>Read encrypted object/snapshot/secret commonly needs kms:Decrypt; writes commonly need kms:GenerateDataKey and/or kms:Encrypt.</w:t>
       </w:r>
     </w:p>
@@ -30516,6 +30665,7 @@
         <w:ind w:left="518" w:hanging="346"/>
       </w:pPr>
       <w:r>
+        <w:lastRenderedPageBreak/>
         <w:t>8.  Check wrong/expired STS credentials and environment credentials overriding the expected instance role.</w:t>
       </w:r>
     </w:p>
@@ -30679,7 +30829,6 @@
                 <w:bCs/>
                 <w:lang w:val="en-AU"/>
               </w:rPr>
-              <w:lastRenderedPageBreak/>
               <w:t>Requirement</w:t>
             </w:r>
           </w:p>
@@ -31091,6 +31240,7 @@
               <w:rPr>
                 <w:lang w:val="en-AU"/>
               </w:rPr>
+              <w:lastRenderedPageBreak/>
               <w:t>Central organization-wide firewall policies</w:t>
             </w:r>
           </w:p>
@@ -31228,6 +31378,7 @@
         <w:rPr>
           <w:b/>
           <w:bCs/>
+          <w:color w:val="FF0000"/>
           <w:lang w:val="en-AU"/>
         </w:rPr>
         <w:t>GuardDuty</w:t>
@@ -31448,7 +31599,6 @@
         <w:rPr>
           <w:lang w:val="en-AU"/>
         </w:rPr>
-        <w:lastRenderedPageBreak/>
         <w:t xml:space="preserve">You do not need to create VPC Flow Logs for </w:t>
       </w:r>
       <w:proofErr w:type="spellStart"/>
@@ -31507,6 +31657,9 @@
       <w:proofErr w:type="spellStart"/>
       <w:r>
         <w:rPr>
+          <w:b/>
+          <w:bCs/>
+          <w:color w:val="FF0000"/>
           <w:lang w:val="en-AU"/>
         </w:rPr>
         <w:t>GuardDuty</w:t>
@@ -31630,14 +31783,12 @@
         </w:rPr>
         <w:t xml:space="preserve">If the question </w:t>
       </w:r>
-      <w:proofErr w:type="gramStart"/>
-      <w:r>
-        <w:rPr>
-          <w:lang w:val="en-AU"/>
-        </w:rPr>
-        <w:t>says</w:t>
-      </w:r>
-      <w:proofErr w:type="gramEnd"/>
+      <w:r>
+        <w:rPr>
+          <w:lang w:val="en-AU"/>
+        </w:rPr>
+        <w:t>says,</w:t>
+      </w:r>
       <w:r>
         <w:rPr>
           <w:lang w:val="en-AU"/>
@@ -31646,48 +31797,53 @@
       </w:r>
       <w:proofErr w:type="spellStart"/>
       <w:r>
-        <w:rPr>
-          <w:lang w:val="en-AU"/>
-        </w:rPr>
-        <w:t>GuardDuty</w:t>
-      </w:r>
-      <w:proofErr w:type="spellEnd"/>
-      <w:r>
-        <w:rPr>
-          <w:lang w:val="en-AU"/>
-        </w:rPr>
-        <w:t>.</w:t>
-      </w:r>
-    </w:p>
-    <w:p>
-      <w:pPr>
         <w:rPr>
           <w:b/>
           <w:bCs/>
           <w:lang w:val="en-AU"/>
         </w:rPr>
-      </w:pPr>
-      <w:r>
+        <w:t>GuardDuty</w:t>
+      </w:r>
+      <w:proofErr w:type="spellEnd"/>
+      <w:r>
+        <w:rPr>
+          <w:lang w:val="en-AU"/>
+        </w:rPr>
+        <w:t>.</w:t>
+      </w:r>
+    </w:p>
+    <w:p>
+      <w:pPr>
         <w:rPr>
           <w:b/>
           <w:bCs/>
           <w:lang w:val="en-AU"/>
         </w:rPr>
-        <w:t>Shield, WAF and Firewall Manager</w:t>
-      </w:r>
-    </w:p>
-    <w:p>
-      <w:pPr>
+      </w:pPr>
+      <w:r>
         <w:rPr>
           <w:b/>
           <w:bCs/>
           <w:lang w:val="en-AU"/>
         </w:rPr>
-      </w:pPr>
-      <w:r>
+        <w:lastRenderedPageBreak/>
+        <w:t>Shield, WAF and Firewall Manager</w:t>
+      </w:r>
+    </w:p>
+    <w:p>
+      <w:pPr>
         <w:rPr>
           <w:b/>
           <w:bCs/>
+          <w:color w:val="FF0000"/>
+          <w:lang w:val="en-AU"/>
+        </w:rPr>
+      </w:pPr>
+      <w:r>
+        <w:rPr>
+          <w:b/>
+          <w:bCs/>
+          <w:color w:val="FF0000"/>
           <w:lang w:val="en-AU"/>
         </w:rPr>
         <w:t>Shield Standard</w:t>
@@ -31766,6 +31922,7 @@
         <w:rPr>
           <w:b/>
           <w:bCs/>
+          <w:color w:val="FF0000"/>
           <w:lang w:val="en-AU"/>
         </w:rPr>
       </w:pPr>
@@ -31773,6 +31930,7 @@
         <w:rPr>
           <w:b/>
           <w:bCs/>
+          <w:color w:val="FF0000"/>
           <w:lang w:val="en-AU"/>
         </w:rPr>
         <w:t>Shield Advanced</w:t>
@@ -31898,6 +32056,7 @@
         <w:rPr>
           <w:b/>
           <w:bCs/>
+          <w:color w:val="FF0000"/>
           <w:lang w:val="en-AU"/>
         </w:rPr>
       </w:pPr>
@@ -31905,6 +32064,7 @@
         <w:rPr>
           <w:b/>
           <w:bCs/>
+          <w:color w:val="FF0000"/>
           <w:lang w:val="en-AU"/>
         </w:rPr>
         <w:t>AWS WAF</w:t>
@@ -31988,7 +32148,6 @@
         <w:rPr>
           <w:lang w:val="en-AU"/>
         </w:rPr>
-        <w:lastRenderedPageBreak/>
         <w:t xml:space="preserve">URI/header/query-string filtering. </w:t>
       </w:r>
     </w:p>
@@ -32031,6 +32190,7 @@
         <w:rPr>
           <w:b/>
           <w:bCs/>
+          <w:color w:val="FF0000"/>
           <w:lang w:val="en-AU"/>
         </w:rPr>
       </w:pPr>
@@ -32038,6 +32198,7 @@
         <w:rPr>
           <w:b/>
           <w:bCs/>
+          <w:color w:val="FF0000"/>
           <w:lang w:val="en-AU"/>
         </w:rPr>
         <w:t>Firewall Manager</w:t>
@@ -32092,6 +32253,7 @@
         <w:rPr>
           <w:b/>
           <w:bCs/>
+          <w:color w:val="FF0000"/>
           <w:lang w:val="en-AU"/>
         </w:rPr>
       </w:pPr>
@@ -32099,6 +32261,7 @@
         <w:rPr>
           <w:b/>
           <w:bCs/>
+          <w:color w:val="FF0000"/>
           <w:lang w:val="en-AU"/>
         </w:rPr>
         <w:t>Security Hub</w:t>
@@ -32148,6 +32311,7 @@
         <w:rPr>
           <w:lang w:val="en-AU"/>
         </w:rPr>
+        <w:lastRenderedPageBreak/>
         <w:t xml:space="preserve">Receives findings from </w:t>
       </w:r>
       <w:proofErr w:type="spellStart"/>
@@ -32512,7 +32676,6 @@
         <w:rPr>
           <w:lang w:val="en-AU"/>
         </w:rPr>
-        <w:lastRenderedPageBreak/>
         <w:t>Investigation graph → Detective.</w:t>
       </w:r>
     </w:p>
@@ -32563,15 +32726,7 @@
                 <w:color w:val="FFFFFF"/>
                 <w:sz w:val="18"/>
               </w:rPr>
-              <w:t>S</w:t>
-            </w:r>
-            <w:r>
-              <w:rPr>
-                <w:b/>
-                <w:color w:val="FFFFFF"/>
-                <w:sz w:val="18"/>
-              </w:rPr>
-              <w:t>ervice</w:t>
+              <w:t>Service</w:t>
             </w:r>
           </w:p>
         </w:tc>
@@ -33074,6 +33229,7 @@
               <w:rPr>
                 <w:sz w:val="16"/>
               </w:rPr>
+              <w:lastRenderedPageBreak/>
               <w:t>Shield</w:t>
             </w:r>
           </w:p>
@@ -33411,7 +33567,6 @@
         <w:pStyle w:val="Heading2"/>
       </w:pPr>
       <w:r>
-        <w:lastRenderedPageBreak/>
         <w:t>Common close-option traps</w:t>
       </w:r>
     </w:p>
@@ -33480,7 +33635,20 @@
         <w:keepLines/>
       </w:pPr>
       <w:r>
-        <w:t>Preventive organization control -&gt; SCP/Firewall Manager; detective compliance -&gt; Config/Security Hub; investigation -&gt; Detective.</w:t>
+        <w:lastRenderedPageBreak/>
+        <w:t xml:space="preserve">Preventive organization control -&gt; SCP/Firewall Manager; </w:t>
+      </w:r>
+      <w:r>
+        <w:br/>
+      </w:r>
+      <w:r>
+        <w:t xml:space="preserve">detective compliance -&gt; Config/Security Hub; </w:t>
+      </w:r>
+      <w:r>
+        <w:br/>
+      </w:r>
+      <w:r>
+        <w:t>investigation -&gt; Detective.</w:t>
       </w:r>
     </w:p>
     <w:p>
@@ -34324,7 +34492,6 @@
         <w:rPr>
           <w:lang w:val="en-AU"/>
         </w:rPr>
-        <w:lastRenderedPageBreak/>
         <w:br/>
       </w:r>
       <w:r>
@@ -34454,6 +34621,7 @@
         <w:rPr>
           <w:lang w:val="en-AU"/>
         </w:rPr>
+        <w:lastRenderedPageBreak/>
         <w:t xml:space="preserve">A fast DNS switch improves RTO, not RPO. </w:t>
       </w:r>
     </w:p>
@@ -34508,7 +34676,21 @@
         <w:rPr>
           <w:lang w:val="en-AU"/>
         </w:rPr>
-        <w:t xml:space="preserve">“Restore from snapshots; cost is most important” → backup and restore. </w:t>
+        <w:t xml:space="preserve">“Restore from snapshots; cost is most important” → </w:t>
+      </w:r>
+      <w:r>
+        <w:rPr>
+          <w:b/>
+          <w:bCs/>
+          <w:lang w:val="en-AU"/>
+        </w:rPr>
+        <w:t>backup and restore</w:t>
+      </w:r>
+      <w:r>
+        <w:rPr>
+          <w:lang w:val="en-AU"/>
+        </w:rPr>
+        <w:t xml:space="preserve">. </w:t>
       </w:r>
     </w:p>
     <w:p>
@@ -34526,7 +34708,21 @@
         <w:rPr>
           <w:lang w:val="en-AU"/>
         </w:rPr>
-        <w:t xml:space="preserve">“Database/data replication running, application servers off” → pilot light. </w:t>
+        <w:t xml:space="preserve">“Database/data replication running, application servers off” → </w:t>
+      </w:r>
+      <w:r>
+        <w:rPr>
+          <w:b/>
+          <w:bCs/>
+          <w:lang w:val="en-AU"/>
+        </w:rPr>
+        <w:t>pilot light</w:t>
+      </w:r>
+      <w:r>
+        <w:rPr>
+          <w:lang w:val="en-AU"/>
+        </w:rPr>
+        <w:t xml:space="preserve">. </w:t>
       </w:r>
     </w:p>
     <w:p>
@@ -34544,7 +34740,21 @@
         <w:rPr>
           <w:lang w:val="en-AU"/>
         </w:rPr>
-        <w:t xml:space="preserve">“Entire application running at reduced capacity” → warm standby. </w:t>
+        <w:t xml:space="preserve">“Entire application running at reduced capacity” → </w:t>
+      </w:r>
+      <w:r>
+        <w:rPr>
+          <w:b/>
+          <w:bCs/>
+          <w:lang w:val="en-AU"/>
+        </w:rPr>
+        <w:t>warm standby</w:t>
+      </w:r>
+      <w:r>
+        <w:rPr>
+          <w:lang w:val="en-AU"/>
+        </w:rPr>
+        <w:t xml:space="preserve">. </w:t>
       </w:r>
     </w:p>
     <w:p>
@@ -34562,7 +34772,21 @@
         <w:rPr>
           <w:lang w:val="en-AU"/>
         </w:rPr>
-        <w:t xml:space="preserve">“Both Regions receive production traffic” → active/active. </w:t>
+        <w:t xml:space="preserve">“Both Regions receive production traffic” → </w:t>
+      </w:r>
+      <w:r>
+        <w:rPr>
+          <w:b/>
+          <w:bCs/>
+          <w:lang w:val="en-AU"/>
+        </w:rPr>
+        <w:t>active/active</w:t>
+      </w:r>
+      <w:r>
+        <w:rPr>
+          <w:lang w:val="en-AU"/>
+        </w:rPr>
+        <w:t xml:space="preserve">. </w:t>
       </w:r>
     </w:p>
     <w:p>
@@ -34696,6 +34920,14 @@
           <w:lang w:val="en-AU"/>
         </w:rPr>
       </w:pPr>
+      <w:r>
+        <w:rPr>
+          <w:b/>
+          <w:bCs/>
+          <w:lang w:val="en-AU"/>
+        </w:rPr>
+        <w:br/>
+      </w:r>
       <w:r>
         <w:rPr>
           <w:b/>
@@ -35088,7 +35320,6 @@
               <w:rPr>
                 <w:lang w:val="en-AU"/>
               </w:rPr>
-              <w:lastRenderedPageBreak/>
               <w:t>Rebuild networking and compute</w:t>
             </w:r>
           </w:p>
@@ -35285,6 +35516,7 @@
         <w:rPr>
           <w:lang w:val="en-AU"/>
         </w:rPr>
+        <w:lastRenderedPageBreak/>
         <w:t xml:space="preserve">DRS data replication needs TCP </w:t>
       </w:r>
       <w:r>
@@ -35500,9 +35732,17 @@
       </w:pPr>
       <w:r>
         <w:rPr>
-          <w:lang w:val="en-AU"/>
-        </w:rPr>
-        <w:t xml:space="preserve">Backup Vault Lock: </w:t>
+          <w:b/>
+          <w:bCs/>
+          <w:lang w:val="en-AU"/>
+        </w:rPr>
+        <w:t>Backup Vault Lock</w:t>
+      </w:r>
+      <w:r>
+        <w:rPr>
+          <w:lang w:val="en-AU"/>
+        </w:rPr>
+        <w:t xml:space="preserve">: </w:t>
       </w:r>
     </w:p>
     <w:p>
@@ -35571,6 +35811,14 @@
           <w:bCs/>
           <w:lang w:val="en-AU"/>
         </w:rPr>
+        <w:br/>
+      </w:r>
+      <w:r>
+        <w:rPr>
+          <w:b/>
+          <w:bCs/>
+          <w:lang w:val="en-AU"/>
+        </w:rPr>
         <w:t>DR troubleshooting order</w:t>
       </w:r>
     </w:p>
@@ -35779,7 +36027,6 @@
         <w:rPr>
           <w:lang w:val="en-AU"/>
         </w:rPr>
-        <w:lastRenderedPageBreak/>
         <w:t xml:space="preserve">Is there a tested failback procedure? </w:t>
       </w:r>
       <w:r>
@@ -36077,6 +36324,7 @@
               <w:rPr>
                 <w:sz w:val="17"/>
               </w:rPr>
+              <w:lastRenderedPageBreak/>
               <w:t>Pilot light</w:t>
             </w:r>
           </w:p>
@@ -36340,11 +36588,6 @@
         </w:tc>
       </w:tr>
     </w:tbl>
-    <w:p>
-      <w:pPr>
-        <w:spacing w:after="20"/>
-      </w:pPr>
-    </w:p>
     <w:p>
       <w:pPr>
         <w:pStyle w:val="Heading2"/>
@@ -36700,7 +36943,6 @@
               <w:rPr>
                 <w:sz w:val="18"/>
               </w:rPr>
-              <w:lastRenderedPageBreak/>
               <w:t>DynamoDB regional writes</w:t>
             </w:r>
           </w:p>
@@ -36828,11 +37070,6 @@
     </w:tbl>
     <w:p>
       <w:pPr>
-        <w:spacing w:after="20"/>
-      </w:pPr>
-    </w:p>
-    <w:p>
-      <w:pPr>
         <w:pStyle w:val="Heading2"/>
       </w:pPr>
       <w:r>
@@ -36854,6 +37091,7 @@
         <w:keepLines/>
       </w:pPr>
       <w:r>
+        <w:lastRenderedPageBreak/>
         <w:t>AWS Backup uses service roles, source permissions, destination vault resource policies and KMS permissions.</w:t>
       </w:r>
     </w:p>
@@ -37392,7 +37630,6 @@
               <w:rPr>
                 <w:sz w:val="18"/>
               </w:rPr>
-              <w:lastRenderedPageBreak/>
               <w:t>Prevent deleting whole stack</w:t>
             </w:r>
           </w:p>
@@ -37424,11 +37661,6 @@
     </w:tbl>
     <w:p>
       <w:pPr>
-        <w:spacing w:after="20"/>
-      </w:pPr>
-    </w:p>
-    <w:p>
-      <w:pPr>
         <w:pStyle w:val="Heading2"/>
       </w:pPr>
       <w:r>
@@ -37450,7 +37682,17 @@
         <w:keepLines/>
       </w:pPr>
       <w:r>
-        <w:t>Templates that create named IAM resources require the appropriate CAPABILITY_NAMED_IAM acknowledgement.</w:t>
+        <w:t xml:space="preserve">Templates that create named IAM resources require the appropriate </w:t>
+      </w:r>
+      <w:r>
+        <w:rPr>
+          <w:i/>
+          <w:iCs/>
+        </w:rPr>
+        <w:t>CAPABILITY_NAMED_IAM</w:t>
+      </w:r>
+      <w:r>
+        <w:t xml:space="preserve"> acknowledgement.</w:t>
       </w:r>
     </w:p>
     <w:p>
@@ -37468,6 +37710,7 @@
         <w:keepLines/>
       </w:pPr>
       <w:r>
+        <w:lastRenderedPageBreak/>
         <w:t>Resource order in a template does not guarantee creation order; Ref/GetAtt create implicit dependencies and DependsOn creates explicit dependencies.</w:t>
       </w:r>
     </w:p>
@@ -38058,11 +38301,6 @@
     </w:tbl>
     <w:p>
       <w:pPr>
-        <w:spacing w:after="20"/>
-      </w:pPr>
-    </w:p>
-    <w:p>
-      <w:pPr>
         <w:pStyle w:val="Heading2"/>
       </w:pPr>
       <w:r>
@@ -38111,6 +38349,7 @@
         <w:keepLines/>
       </w:pPr>
       <w:r>
+        <w:lastRenderedPageBreak/>
         <w:t>Visibility timeout should exceed normal processing time; delete after successful processing; use DLQ redrive policy after repeated failures.</w:t>
       </w:r>
     </w:p>
@@ -38155,7 +38394,19 @@
         <w:keepLines/>
       </w:pPr>
       <w:r>
-        <w:t>Compute Optimizer -&gt; rightsizing recommendations; Cost Explorer -&gt; historical cost analysis; Cost and Usage Report -&gt; detailed records.</w:t>
+        <w:t xml:space="preserve">Compute Optimizer -&gt; rightsizing recommendations; </w:t>
+      </w:r>
+      <w:r>
+        <w:br/>
+      </w:r>
+      <w:r>
+        <w:t xml:space="preserve">Cost Explorer -&gt; historical cost analysis; </w:t>
+      </w:r>
+      <w:r>
+        <w:br/>
+      </w:r>
+      <w:r>
+        <w:t>Cost and Usage Report -&gt; detailed records.</w:t>
       </w:r>
     </w:p>
     <w:p>
@@ -38209,7 +38460,6 @@
       </w:pPr>
       <w:bookmarkStart w:id="14" w:name="sec_playbooks"/>
       <w:r>
-        <w:lastRenderedPageBreak/>
         <w:t>15. Consolidated troubleshooting playbooks</w:t>
       </w:r>
       <w:bookmarkEnd w:id="14"/>
@@ -38307,6 +38557,7 @@
         <w:ind w:left="518" w:hanging="346"/>
       </w:pPr>
       <w:r>
+        <w:lastRenderedPageBreak/>
         <w:t>2.  For general IPv4 egress, verify private route -&gt; NAT, NAT public subnet -&gt; IGW and EIP.</w:t>
       </w:r>
     </w:p>
@@ -38441,7 +38692,6 @@
         <w:pStyle w:val="Heading2"/>
       </w:pPr>
       <w:r>
-        <w:lastRenderedPageBreak/>
         <w:t>AccessDenied</w:t>
       </w:r>
     </w:p>
@@ -38655,6 +38905,7 @@
               <w:rPr>
                 <w:sz w:val="18"/>
               </w:rPr>
+              <w:lastRenderedPageBreak/>
               <w:t>Observe</w:t>
             </w:r>
           </w:p>
@@ -39147,7 +39398,6 @@
         <w:keepLines/>
       </w:pPr>
       <w:r>
-        <w:lastRenderedPageBreak/>
         <w:t xml:space="preserve">ELB 5XX = load balancer; </w:t>
       </w:r>
       <w:r>
@@ -39237,6 +39487,7 @@
         <w:keepLines/>
       </w:pPr>
       <w:r>
+        <w:lastRenderedPageBreak/>
         <w:t xml:space="preserve">Run Command = one-time; </w:t>
       </w:r>
       <w:r>
@@ -39467,7 +39718,6 @@
         <w:rPr>
           <w:sz w:val="18"/>
         </w:rPr>
-        <w:lastRenderedPageBreak/>
         <w:t>9.  A NAT gateway works only when the private subnet route points to it and the NAT gateway sits in a public subnet with an internet-gateway route.</w:t>
       </w:r>
     </w:p>
@@ -39598,6 +39848,7 @@
         <w:rPr>
           <w:sz w:val="18"/>
         </w:rPr>
+        <w:lastRenderedPageBreak/>
         <w:t>19.  Encrypted snapshot sharing requires both snapshot permission and KMS key permission; matching aliases in another account do not grant access.</w:t>
       </w:r>
     </w:p>
@@ -39936,7 +40187,6 @@
         <w:rPr>
           <w:sz w:val="18"/>
         </w:rPr>
-        <w:lastRenderedPageBreak/>
         <w:t>45.  EC2 Instance Connect supplies a temporary public key, but normal network security-group rules still apply.</w:t>
       </w:r>
     </w:p>
@@ -40093,6 +40343,7 @@
         <w:rPr>
           <w:sz w:val="18"/>
         </w:rPr>
+        <w:lastRenderedPageBreak/>
         <w:t>57.  Sharing an encrypted AMI requires sharing both the AMI and the KMS key permissions.</w:t>
       </w:r>
     </w:p>
@@ -40418,7 +40669,6 @@
         <w:rPr>
           <w:sz w:val="18"/>
         </w:rPr>
-        <w:lastRenderedPageBreak/>
         <w:t>82.  Certificates attach to ALB listeners, not target groups; ACM is the managed certificate source.</w:t>
       </w:r>
     </w:p>
@@ -40562,6 +40812,7 @@
         <w:rPr>
           <w:sz w:val="18"/>
         </w:rPr>
+        <w:lastRenderedPageBreak/>
         <w:t>93.  For incremental snapshots, add only the first full set of blocks plus blocks changed or added later.</w:t>
       </w:r>
     </w:p>
@@ -40887,7 +41138,6 @@
         <w:rPr>
           <w:sz w:val="18"/>
         </w:rPr>
-        <w:lastRenderedPageBreak/>
         <w:t>118.  Centralize logs before the instance or disk disappears, and set the log-group retention period to at least the required search window.</w:t>
       </w:r>
     </w:p>
@@ -41018,6 +41268,7 @@
         <w:rPr>
           <w:sz w:val="18"/>
         </w:rPr>
+        <w:lastRenderedPageBreak/>
         <w:t>128.  When scheduled backups mysteriously stop, check the DB instance state and free storage before changing retention.</w:t>
       </w:r>
     </w:p>
@@ -51672,6 +51923,7 @@
   <w:style w:type="character" w:default="1" w:styleId="DefaultParagraphFont">
     <w:name w:val="Default Paragraph Font"/>
     <w:uiPriority w:val="1"/>
+    <w:semiHidden/>
     <w:unhideWhenUsed/>
   </w:style>
   <w:style w:type="table" w:default="1" w:styleId="TableNormal">

</xml_diff>